<commit_message>
feat: finalize phase one payments and introductory fee
</commit_message>
<xml_diff>
--- a/docs/Get-Gold-Vendor-Pre-Agreement.docx
+++ b/docs/Get-Gold-Vendor-Pre-Agreement.docx
@@ -237,7 +237,7 @@
         <w:tab/>
       </w:r>
       <w:r>
-        <w:t>Listing of your products on the Get Gold platform at no charge during the Free Period (clause 5).</w:t>
+        <w:t>Listing of your products on the Get Gold platform at no charge during Phase 1 (clause 5).</w:t>
       </w:r>
     </w:p>
     <w:p>
@@ -269,7 +269,7 @@
         <w:tab/>
       </w:r>
       <w:r>
-        <w:t>Transparent display of each price component — gold value, making charge, stone value and your premium — shown separately to the customer.</w:t>
+        <w:t>Transparent display of each price component — gold value, making charge, certificate or assay fee, stone value, your premium, Get Gold service fee and delivery — shown separately to the customer.</w:t>
       </w:r>
     </w:p>
     <w:p>
@@ -348,7 +348,7 @@
       </w:r>
       <w:r/>
       <w:r>
-        <w:t>shown to the customer at the time of reservation, for the reservation window (10 minutes at the locked gold rate, then the prevailing rate), provided the customer completes within that window.</w:t>
+        <w:t>shown to the customer. The initial stock and price request normally remains open for ten (10) minutes. If you accept within that window, the displayed total remains fixed until the payment deadline shown to the customer: initially thirty (30) minutes for bank transfer and twenty-four (24) hours for cash or card at delivery or collection.</w:t>
       </w:r>
     </w:p>
     <w:p>
@@ -380,7 +380,7 @@
         <w:tab/>
       </w:r>
       <w:r>
-        <w:t>You respond to a reservation within ________ hours during business hours.</w:t>
+        <w:t>You respond to a reservation within the initial ten-minute window while accepting orders. An expired request cannot be revived without a new stock and price check.</w:t>
       </w:r>
     </w:p>
     <w:p>
@@ -404,7 +404,7 @@
         <w:pStyle w:val="GGH1"/>
       </w:pPr>
       <w:r>
-        <w:t>5.  Commercial terms — fees</w:t>
+        <w:t>5.  Commercial terms and customer service fee</w:t>
       </w:r>
     </w:p>
     <w:p>
@@ -423,19 +423,10 @@
         <w:rPr>
           <w:b/>
         </w:rPr>
-        <w:t xml:space="preserve">Free Period.  </w:t>
+        <w:t xml:space="preserve">No Vendor commission during Phase 1.  </w:t>
       </w:r>
       <w:r>
-        <w:t xml:space="preserve">Listing on Get Gold is </w:t>
-      </w:r>
-      <w:r>
-        <w:rPr>
-          <w:b/>
-        </w:rPr>
-        <w:t>free of any fee or commission for six (6) months</w:t>
-      </w:r>
-      <w:r>
-        <w:t xml:space="preserve"> from the date of signature. During the Free Period you owe Get Gold nothing.</w:t>
+        <w:t>Get Gold charges you no listing fee, subscription fee or commission, including no commission on your making charge or Vendor Premium, for six (6) months from signature. No Vendor charge begins automatically when that period ends. Any future Vendor fee requires a separate written agreement accepted by both parties.</w:t>
       </w:r>
     </w:p>
     <w:p>
@@ -454,28 +445,10 @@
         <w:rPr>
           <w:b/>
         </w:rPr>
-        <w:t xml:space="preserve">Commission after the Free Period.  </w:t>
+        <w:t xml:space="preserve">Customer service fee.  </w:t>
       </w:r>
       <w:r>
-        <w:t xml:space="preserve">After the Free Period, Get Gold intends to charge a commission of </w:t>
-      </w:r>
-      <w:r>
-        <w:rPr>
-          <w:b/>
-        </w:rPr>
-        <w:t>ten percent (10%)</w:t>
-      </w:r>
-      <w:r>
-        <w:t xml:space="preserve"> calculated </w:t>
-      </w:r>
-      <w:r>
-        <w:rPr>
-          <w:b/>
-        </w:rPr>
-        <w:t>only on the Making Charge and the Vendor Premium</w:t>
-      </w:r>
-      <w:r>
-        <w:t xml:space="preserve"> of each completed sale originating from the platform.</w:t>
+        <w:t>Get Gold may add a separately disclosed service fee paid by the customer. The Phase 1 standard rate is one percent (1%) of the merchandise subtotal, excluding delivery. Each new customer receives fifty percent (50%) off this service fee on their first three qualifying orders, producing an effective rate of one-half of one percent (0.5%). The exact percentage and amount must be shown before the order is placed.</w:t>
       </w:r>
     </w:p>
     <w:p>
@@ -494,10 +467,10 @@
         <w:rPr>
           <w:b/>
         </w:rPr>
-        <w:t xml:space="preserve">The commission is never calculated on the gold value or the stone value.  </w:t>
+        <w:t xml:space="preserve">Collection and remittance.  </w:t>
       </w:r>
       <w:r>
-        <w:t>The metal and the stones are a pass-through and Get Gold takes no share of them.</w:t>
+        <w:t>Where the customer pays you directly by cash, your card terminal or bank transfer, you collect the complete displayed order total. The separately identified Get Gold service-fee amount is collected by you on Get Gold's behalf and does not reduce the merchandise or delivery amount owed to you. You must not relabel, conceal or retain that service-fee amount as your sale proceeds.</w:t>
       </w:r>
     </w:p>
     <w:p>
@@ -513,13 +486,7 @@
         <w:tab/>
       </w:r>
       <w:r>
-        <w:rPr>
-          <w:b/>
-        </w:rPr>
-        <w:t xml:space="preserve">If the Making Charge and Vendor Premium are zero, the commission is zero.  </w:t>
-      </w:r>
-      <w:r>
-        <w:t>You never pay commission on a sale from which you earned no margin.</w:t>
+        <w:t>Get Gold will provide a statement of completed orders and customer service fees collected. You will reconcile it against your invoices and payment records and remit undisputed amounts within ________ days. Payment destination and tax-invoice requirements will be confirmed in writing after Get Gold is incorporated and before any remittance becomes due.</w:t>
       </w:r>
     </w:p>
     <w:p>
@@ -535,22 +502,7 @@
         <w:tab/>
       </w:r>
       <w:r>
-        <w:rPr>
-          <w:b/>
-        </w:rPr>
-        <w:t xml:space="preserve">Rates may change.  </w:t>
-      </w:r>
-      <w:r>
-        <w:t xml:space="preserve">Get Gold may change the commission rate, introduce listing or other fees, or vary the Free Period, </w:t>
-      </w:r>
-      <w:r>
-        <w:rPr>
-          <w:b/>
-        </w:rPr>
-        <w:t>on not less than thirty (30) days’ written notice</w:t>
-      </w:r>
-      <w:r>
-        <w:t xml:space="preserve"> to you. If you do not accept a change, you may end this MOU under clause 11 before it takes effect, at no cost.</w:t>
+        <w:t>Cancelled, rejected and expired unpaid orders carry no service fee. A full or partial customer refund produces the corresponding service-fee adjustment. A paid order keeps its introductory-order position even if later refunded; an unpaid cancelled, rejected or expired order does not.</w:t>
       </w:r>
     </w:p>
     <w:p>
@@ -569,25 +521,9 @@
         <w:rPr>
           <w:b/>
         </w:rPr>
-        <w:t>No fee is payable, and no invoice will be issued, before Get Gold is incorporated in the UAE and has notified you in writing of the applicable rate.</w:t>
+        <w:t>No Get Gold fee is payable or remittable before Get Gold is incorporated in the UAE and has notified you in writing that the customer-fee collection and settlement process is active.</w:t>
       </w:r>
       <w:r/>
-    </w:p>
-    <w:p>
-      <w:pPr>
-        <w:spacing w:after="100"/>
-        <w:ind w:left="624" w:hanging="624"/>
-      </w:pPr>
-      <w:r>
-        <w:rPr>
-          <w:b/>
-        </w:rPr>
-        <w:t>5.7</w:t>
-        <w:tab/>
-      </w:r>
-      <w:r>
-        <w:t>Commission is invoiced monthly in arrears against sales you have confirmed as completed, and is payable within ________ days of invoice.</w:t>
-      </w:r>
     </w:p>
     <w:p>
       <w:pPr>
@@ -710,6 +646,38 @@
     </w:p>
     <w:p>
       <w:pPr>
+        <w:spacing w:after="100"/>
+        <w:ind w:left="624" w:hanging="624"/>
+      </w:pPr>
+      <w:r>
+        <w:rPr>
+          <w:b/>
+        </w:rPr>
+        <w:t>6.6</w:t>
+        <w:tab/>
+      </w:r>
+      <w:r>
+        <w:t>The customer may choose store collection, which has no delivery fee, or an available delivery method. Payment choices may include cash, your card terminal and bank transfer to your verified business bank account. Online marketplace payment must not be offered until Get Gold confirms that an approved payment provider and settlement process are operational.</w:t>
+      </w:r>
+    </w:p>
+    <w:p>
+      <w:pPr>
+        <w:spacing w:after="100"/>
+        <w:ind w:left="624" w:hanging="624"/>
+      </w:pPr>
+      <w:r>
+        <w:rPr>
+          <w:b/>
+        </w:rPr>
+        <w:t>6.7</w:t>
+        <w:tab/>
+      </w:r>
+      <w:r>
+        <w:t>For bank transfer, the customer waits for your stock acceptance, then sends the exact displayed amount and privately submits a transaction reference and receipt. A receipt image alone is not proof of payment. You must confirm cleared funds before the order proceeds. Late, short, duplicate or disputed transfers and related refunds remain your responsibility as seller.</w:t>
+      </w:r>
+    </w:p>
+    <w:p>
+      <w:pPr>
         <w:pStyle w:val="GGH1"/>
       </w:pPr>
       <w:r>
@@ -797,7 +765,7 @@
         <w:rPr>
           <w:b/>
         </w:rPr>
-        <w:t>you will not, for twelve (12) months from that introduction, deliberately take that customer’s transaction outside the platform in order to avoid commission that would otherwise be payable.</w:t>
+        <w:t>you will not, for twelve (12) months from that introduction, deliberately omit or misreport that customer’s transaction in order to avoid an applicable Get Gold customer service fee or agreed platform process.</w:t>
       </w:r>
     </w:p>
     <w:p>
@@ -893,7 +861,7 @@
         <w:tab/>
       </w:r>
       <w:r>
-        <w:t>Get Gold owns the platform, its software, brand, design and all data it generates, including listing pages, pricing displays and any photography Get Gold produces.</w:t>
+        <w:t>Get Gold owns the platform, its software, brand, design, listing-page presentation, pricing displays and any photography Get Gold produces. Personal data remains subject to applicable privacy rights and is not transferred into Get Gold's ownership by this clause.</w:t>
       </w:r>
     </w:p>
     <w:p>
@@ -1063,7 +1031,7 @@
         <w:t xml:space="preserve">On termination:  </w:t>
       </w:r>
       <w:r>
-        <w:t>Get Gold removes your listings; you honour any reservation a customer has already made and you have already confirmed, or refund the customer in full; and you settle any commission properly invoiced and outstanding. Clauses 8, 9, 10, 12 and 14 survive.</w:t>
+        <w:t>Get Gold removes your listings; you honour any reservation a customer has already made and you have already confirmed, or refund the customer in full; and you settle any customer service fees properly collected on Get Gold's behalf and outstanding. Clauses 8, 9, 10, 12 and 14 survive.</w:t>
       </w:r>
     </w:p>
     <w:p>
@@ -1559,7 +1527,7 @@
                 <w:b/>
                 <w:sz w:val="20"/>
               </w:rPr>
-              <w:t>Reservation response time (clause 4.4)</w:t>
+              <w:t>Payment methods offered</w:t>
             </w:r>
           </w:p>
         </w:tc>
@@ -1569,7 +1537,65 @@
           </w:tcPr>
           <w:p>
             <w:r>
-              <w:t>________ hours</w:t>
+              <w:t>☐  Cash      ☐  Vendor card terminal      ☐  Bank transfer</w:t>
+            </w:r>
+          </w:p>
+        </w:tc>
+      </w:tr>
+      <w:tr>
+        <w:trPr>
+          <w:trHeight w:val="482"/>
+        </w:trPr>
+        <w:tc>
+          <w:tcPr>
+            <w:tcW w:type="dxa" w:w="3628"/>
+          </w:tcPr>
+          <w:p>
+            <w:r>
+              <w:rPr>
+                <w:b/>
+                <w:sz w:val="20"/>
+              </w:rPr>
+              <w:t>Bank-transfer beneficiary confirmed</w:t>
+            </w:r>
+          </w:p>
+        </w:tc>
+        <w:tc>
+          <w:tcPr>
+            <w:tcW w:type="dxa" w:w="5783"/>
+          </w:tcPr>
+          <w:p>
+            <w:r>
+              <w:t>☐  Yes      ☐  Not offered</w:t>
+            </w:r>
+          </w:p>
+        </w:tc>
+      </w:tr>
+      <w:tr>
+        <w:trPr>
+          <w:trHeight w:val="482"/>
+        </w:trPr>
+        <w:tc>
+          <w:tcPr>
+            <w:tcW w:type="dxa" w:w="3628"/>
+          </w:tcPr>
+          <w:p>
+            <w:r>
+              <w:rPr>
+                <w:b/>
+                <w:sz w:val="20"/>
+              </w:rPr>
+              <w:t>Service-fee remittance period</w:t>
+            </w:r>
+          </w:p>
+        </w:tc>
+        <w:tc>
+          <w:tcPr>
+            <w:tcW w:type="dxa" w:w="5783"/>
+          </w:tcPr>
+          <w:p>
+            <w:r>
+              <w:t>________ days</w:t>
             </w:r>
           </w:p>
         </w:tc>

</xml_diff>

<commit_message>
Vendor pre-agreement: founding vendors free for life
Replace the six-month no-commission term (clause 5.1) with a founding
vendor term: no listing fee, subscription or commission for as long as
the store lists, and update clause 3.1 to match. Regenerated the docx
with scripts/build-mou.py.

Co-Authored-By: Claude Opus 5.5 <noreply@anthropic.com>
Claude-Session: https://claude.ai/code/session_01WdaanC8KPRARxf2kCqJBe3
</commit_message>
<xml_diff>
--- a/docs/Get-Gold-Vendor-Pre-Agreement.docx
+++ b/docs/Get-Gold-Vendor-Pre-Agreement.docx
@@ -237,7 +237,7 @@
         <w:tab/>
       </w:r>
       <w:r>
-        <w:t>Listing of your products on the Get Gold platform at no charge during Phase 1 (clause 5).</w:t>
+        <w:t>Listing of your products on the Get Gold platform at no charge, for life, as a Founding Vendor (clause 5).</w:t>
       </w:r>
     </w:p>
     <w:p>
@@ -423,10 +423,10 @@
         <w:rPr>
           <w:b/>
         </w:rPr>
-        <w:t xml:space="preserve">No Vendor commission during Phase 1.  </w:t>
+        <w:t xml:space="preserve">Founding Vendor: free for life.  </w:t>
       </w:r>
       <w:r>
-        <w:t>Get Gold charges you no listing fee, subscription fee or commission, including no commission on your making charge or Vendor Premium, for six (6) months from signature. No Vendor charge begins automatically when that period ends. Any future Vendor fee requires a separate written agreement accepted by both parties.</w:t>
+        <w:t>You join Get Gold as a Founding Vendor. For as long as you list on Get Gold, Get Gold will charge you no listing fee, subscription fee or commission, including no commission on your making charge or Vendor Premium. This founding term continues under any later agreement that replaces this MOU, and is not affected by any fee Get Gold may introduce for vendors who join after the founding offer closes.</w:t>
       </w:r>
     </w:p>
     <w:p>

</xml_diff>